<commit_message>
docs: correct Application Owner identity — Michael Pisano (mpisano@riverwestpartners.com)
- Named Michael Pisano explicitly in the cover page contacts table
- Updated Role 2 description to name him as Application Owner (not Admin)
- Updated env/setup section and troubleshooting FAQ to reference him by name
- All 'contact the Application Owner' prompts now include name + email

https://claude.ai/code/session_019XnFKDaW5cVxd7JfGejRcK
</commit_message>
<xml_diff>
--- a/RiverWest-Travel-Reporting-Onboarding-Guide.docx
+++ b/RiverWest-Travel-Reporting-Onboarding-Guide.docx
@@ -78,7 +78,7 @@
     </w:p>
     <w:p>
       <w:pPr>
-        <w:spacing w:after="80"/>
+        <w:spacing w:after="240"/>
         <w:jc w:val="center"/>
       </w:pPr>
       <w:r>
@@ -89,744 +89,6 @@
         </w:rPr>
         <w:t xml:space="preserve">Effective: February 28, 2026</w:t>
       </w:r>
-    </w:p>
-    <w:p>
-      <w:r>
-        <w:br w:type="page"/>
-      </w:r>
-    </w:p>
-    <w:p>
-      <w:pPr>
-        <w:pStyle w:val="Heading1"/>
-        <w:spacing w:after="160" w:before="480"/>
-      </w:pPr>
-      <w:r>
-        <w:rPr>
-          <w:b/>
-          <w:bCs/>
-          <w:color w:val="1E3A5F"/>
-          <w:sz w:val="36"/>
-          <w:szCs w:val="36"/>
-        </w:rPr>
-        <w:t xml:space="preserve">1. System Overview</w:t>
-      </w:r>
-    </w:p>
-    <w:p>
-      <w:pPr>
-        <w:pBdr>
-          <w:bottom w:val="single" w:color="1E3A5F" w:sz="6"/>
-        </w:pBdr>
-        <w:spacing w:after="160"/>
-      </w:pPr>
-    </w:p>
-    <w:p>
-      <w:pPr>
-        <w:spacing w:after="120"/>
-      </w:pPr>
-      <w:r>
-        <w:rPr>
-          <w:sz w:val="22"/>
-          <w:szCs w:val="22"/>
-        </w:rPr>
-        <w:t xml:space="preserve">The RiverWest Travel &amp; Mileage Reporting System is a web application that allows RiverWest Properties employees to record business trips, calculate mileage reimbursements, and submit expense reports through a structured multi-step approval workflow.</w:t>
-      </w:r>
-    </w:p>
-    <w:p>
-      <w:pPr>
-        <w:spacing w:after="120"/>
-      </w:pPr>
-      <w:r>
-        <w:rPr>
-          <w:sz w:val="22"/>
-          <w:szCs w:val="22"/>
-        </w:rPr>
-        <w:t xml:space="preserve">Once an approver approves a report, an Excel summary is automatically emailed to the accounting team — eliminating manual spreadsheet work and providing a complete, auditable record of all reimbursements.</w:t>
-      </w:r>
-    </w:p>
-    <w:p>
-      <w:pPr>
-        <w:spacing w:after="160"/>
-      </w:pPr>
-    </w:p>
-    <w:p>
-      <w:pPr>
-        <w:pStyle w:val="Heading2"/>
-        <w:spacing w:after="120" w:before="320"/>
-      </w:pPr>
-      <w:r>
-        <w:rPr>
-          <w:b/>
-          <w:bCs/>
-          <w:color w:val="1E3A5F"/>
-          <w:sz w:val="28"/>
-          <w:szCs w:val="28"/>
-        </w:rPr>
-        <w:t xml:space="preserve">1.1  Key Capabilities</w:t>
-      </w:r>
-    </w:p>
-    <w:p>
-      <w:pPr>
-        <w:pStyle w:val="ListParagraph"/>
-        <w:numPr>
-          <w:ilvl w:val="0"/>
-          <w:numId w:val="1"/>
-        </w:numPr>
-        <w:spacing w:after="80"/>
-      </w:pPr>
-      <w:r>
-        <w:rPr>
-          <w:sz w:val="22"/>
-          <w:szCs w:val="22"/>
-        </w:rPr>
-        <w:t xml:space="preserve">Employees log trips by selecting origin and destination properties or addresses</w:t>
-      </w:r>
-    </w:p>
-    <w:p>
-      <w:pPr>
-        <w:pStyle w:val="ListParagraph"/>
-        <w:numPr>
-          <w:ilvl w:val="0"/>
-          <w:numId w:val="1"/>
-        </w:numPr>
-        <w:spacing w:after="80"/>
-      </w:pPr>
-      <w:r>
-        <w:rPr>
-          <w:sz w:val="22"/>
-          <w:szCs w:val="22"/>
-        </w:rPr>
-        <w:t xml:space="preserve">Distance is calculated automatically via the Google Maps Distance Matrix API</w:t>
-      </w:r>
-    </w:p>
-    <w:p>
-      <w:pPr>
-        <w:pStyle w:val="ListParagraph"/>
-        <w:numPr>
-          <w:ilvl w:val="0"/>
-          <w:numId w:val="1"/>
-        </w:numPr>
-        <w:spacing w:after="80"/>
-      </w:pPr>
-      <w:r>
-        <w:rPr>
-          <w:sz w:val="22"/>
-          <w:szCs w:val="22"/>
-        </w:rPr>
-        <w:t xml:space="preserve">Reports are submitted to one or more assigned approvers for review</w:t>
-      </w:r>
-    </w:p>
-    <w:p>
-      <w:pPr>
-        <w:pStyle w:val="ListParagraph"/>
-        <w:numPr>
-          <w:ilvl w:val="0"/>
-          <w:numId w:val="1"/>
-        </w:numPr>
-        <w:spacing w:after="80"/>
-      </w:pPr>
-      <w:r>
-        <w:rPr>
-          <w:sz w:val="22"/>
-          <w:szCs w:val="22"/>
-        </w:rPr>
-        <w:t xml:space="preserve">Approvers can annotate individual trips with notes and approve or return for revision</w:t>
-      </w:r>
-    </w:p>
-    <w:p>
-      <w:pPr>
-        <w:pStyle w:val="ListParagraph"/>
-        <w:numPr>
-          <w:ilvl w:val="0"/>
-          <w:numId w:val="1"/>
-        </w:numPr>
-        <w:spacing w:after="80"/>
-      </w:pPr>
-      <w:r>
-        <w:rPr>
-          <w:sz w:val="22"/>
-          <w:szCs w:val="22"/>
-        </w:rPr>
-        <w:t xml:space="preserve">Approved reports are exported as a formatted Excel workbook and emailed to accounting</w:t>
-      </w:r>
-    </w:p>
-    <w:p>
-      <w:pPr>
-        <w:pStyle w:val="ListParagraph"/>
-        <w:numPr>
-          <w:ilvl w:val="0"/>
-          <w:numId w:val="1"/>
-        </w:numPr>
-        <w:spacing w:after="80"/>
-      </w:pPr>
-      <w:r>
-        <w:rPr>
-          <w:sz w:val="22"/>
-          <w:szCs w:val="22"/>
-        </w:rPr>
-        <w:t xml:space="preserve">Mileage reimbursement rates are managed in the application by the Application Owner</w:t>
-      </w:r>
-    </w:p>
-    <w:p>
-      <w:pPr>
-        <w:pStyle w:val="ListParagraph"/>
-        <w:numPr>
-          <w:ilvl w:val="0"/>
-          <w:numId w:val="1"/>
-        </w:numPr>
-        <w:spacing w:after="80"/>
-      </w:pPr>
-      <w:r>
-        <w:rPr>
-          <w:sz w:val="22"/>
-          <w:szCs w:val="22"/>
-        </w:rPr>
-        <w:t xml:space="preserve">New user accounts require activation by the Application Owner before access is granted</w:t>
-      </w:r>
-    </w:p>
-    <w:p>
-      <w:pPr>
-        <w:pStyle w:val="ListParagraph"/>
-        <w:numPr>
-          <w:ilvl w:val="0"/>
-          <w:numId w:val="1"/>
-        </w:numPr>
-        <w:spacing w:after="80"/>
-      </w:pPr>
-      <w:r>
-        <w:rPr>
-          <w:sz w:val="22"/>
-          <w:szCs w:val="22"/>
-        </w:rPr>
-        <w:t xml:space="preserve">Soft-deleted reports are retained in a log accessible to the Application Owner</w:t>
-      </w:r>
-    </w:p>
-    <w:p>
-      <w:pPr>
-        <w:spacing w:after="160"/>
-      </w:pPr>
-    </w:p>
-    <w:p>
-      <w:pPr>
-        <w:pStyle w:val="Heading2"/>
-        <w:spacing w:after="120" w:before="320"/>
-      </w:pPr>
-      <w:r>
-        <w:rPr>
-          <w:b/>
-          <w:bCs/>
-          <w:color w:val="1E3A5F"/>
-          <w:sz w:val="28"/>
-          <w:szCs w:val="28"/>
-        </w:rPr>
-        <w:t xml:space="preserve">1.2  Technology Stack</w:t>
-      </w:r>
-    </w:p>
-    <w:tbl>
-      <w:tblPr>
-        <w:tblW w:type="pct" w:w="100%"/>
-        <w:tblBorders>
-          <w:top w:val="single" w:color="auto" w:sz="4"/>
-          <w:left w:val="single" w:color="auto" w:sz="4"/>
-          <w:bottom w:val="single" w:color="auto" w:sz="4"/>
-          <w:right w:val="single" w:color="auto" w:sz="4"/>
-          <w:insideH w:val="single" w:color="auto" w:sz="4"/>
-          <w:insideV w:val="single" w:color="auto" w:sz="4"/>
-        </w:tblBorders>
-      </w:tblPr>
-      <w:tblGrid>
-        <w:gridCol w:w="100"/>
-        <w:gridCol w:w="100"/>
-      </w:tblGrid>
-      <w:tr>
-        <w:trPr>
-          <w:tblHeader/>
-        </w:trPr>
-        <w:tc>
-          <w:tcPr>
-            <w:tcW w:type="pct" w:w="30%"/>
-            <w:shd w:fill="1E3A5F" w:val="solid"/>
-            <w:tcMar>
-              <w:top w:type="dxa" w:w="80"/>
-              <w:left w:type="dxa" w:w="120"/>
-              <w:bottom w:type="dxa" w:w="80"/>
-              <w:right w:type="dxa" w:w="120"/>
-            </w:tcMar>
-          </w:tcPr>
-          <w:p>
-            <w:pPr>
-              <w:jc w:val="left"/>
-            </w:pPr>
-            <w:r>
-              <w:rPr>
-                <w:b/>
-                <w:bCs/>
-                <w:color w:val="FFFFFF"/>
-                <w:sz w:val="20"/>
-                <w:szCs w:val="20"/>
-              </w:rPr>
-              <w:t xml:space="preserve">Component</w:t>
-            </w:r>
-          </w:p>
-        </w:tc>
-        <w:tc>
-          <w:tcPr>
-            <w:tcW w:type="pct" w:w="70%"/>
-            <w:shd w:fill="1E3A5F" w:val="solid"/>
-            <w:tcMar>
-              <w:top w:type="dxa" w:w="80"/>
-              <w:left w:type="dxa" w:w="120"/>
-              <w:bottom w:type="dxa" w:w="80"/>
-              <w:right w:type="dxa" w:w="120"/>
-            </w:tcMar>
-          </w:tcPr>
-          <w:p>
-            <w:pPr>
-              <w:jc w:val="left"/>
-            </w:pPr>
-            <w:r>
-              <w:rPr>
-                <w:b/>
-                <w:bCs/>
-                <w:color w:val="FFFFFF"/>
-                <w:sz w:val="20"/>
-                <w:szCs w:val="20"/>
-              </w:rPr>
-              <w:t xml:space="preserve">Technology</w:t>
-            </w:r>
-          </w:p>
-        </w:tc>
-      </w:tr>
-      <w:tr>
-        <w:tc>
-          <w:tcPr>
-            <w:tcW w:type="pct" w:w="30%"/>
-            <w:shd w:fill="FFFFFF" w:val="solid"/>
-            <w:tcMar>
-              <w:top w:type="dxa" w:w="80"/>
-              <w:left w:type="dxa" w:w="120"/>
-              <w:bottom w:type="dxa" w:w="80"/>
-              <w:right w:type="dxa" w:w="120"/>
-            </w:tcMar>
-          </w:tcPr>
-          <w:p>
-            <w:r>
-              <w:rPr>
-                <w:sz w:val="20"/>
-                <w:szCs w:val="20"/>
-              </w:rPr>
-              <w:t xml:space="preserve">Framework</w:t>
-            </w:r>
-          </w:p>
-        </w:tc>
-        <w:tc>
-          <w:tcPr>
-            <w:tcW w:type="pct" w:w="70%"/>
-            <w:shd w:fill="FFFFFF" w:val="solid"/>
-            <w:tcMar>
-              <w:top w:type="dxa" w:w="80"/>
-              <w:left w:type="dxa" w:w="120"/>
-              <w:bottom w:type="dxa" w:w="80"/>
-              <w:right w:type="dxa" w:w="120"/>
-            </w:tcMar>
-          </w:tcPr>
-          <w:p>
-            <w:r>
-              <w:rPr>
-                <w:sz w:val="20"/>
-                <w:szCs w:val="20"/>
-              </w:rPr>
-              <w:t xml:space="preserve">Next.js 14 (App Router, React Server Components)</w:t>
-            </w:r>
-          </w:p>
-        </w:tc>
-      </w:tr>
-      <w:tr>
-        <w:tc>
-          <w:tcPr>
-            <w:tcW w:type="pct" w:w="30%"/>
-            <w:shd w:fill="EBF0F7" w:val="solid"/>
-            <w:tcMar>
-              <w:top w:type="dxa" w:w="80"/>
-              <w:left w:type="dxa" w:w="120"/>
-              <w:bottom w:type="dxa" w:w="80"/>
-              <w:right w:type="dxa" w:w="120"/>
-            </w:tcMar>
-          </w:tcPr>
-          <w:p>
-            <w:r>
-              <w:rPr>
-                <w:sz w:val="20"/>
-                <w:szCs w:val="20"/>
-              </w:rPr>
-              <w:t xml:space="preserve">Database</w:t>
-            </w:r>
-          </w:p>
-        </w:tc>
-        <w:tc>
-          <w:tcPr>
-            <w:tcW w:type="pct" w:w="70%"/>
-            <w:shd w:fill="EBF0F7" w:val="solid"/>
-            <w:tcMar>
-              <w:top w:type="dxa" w:w="80"/>
-              <w:left w:type="dxa" w:w="120"/>
-              <w:bottom w:type="dxa" w:w="80"/>
-              <w:right w:type="dxa" w:w="120"/>
-            </w:tcMar>
-          </w:tcPr>
-          <w:p>
-            <w:r>
-              <w:rPr>
-                <w:sz w:val="20"/>
-                <w:szCs w:val="20"/>
-              </w:rPr>
-              <w:t xml:space="preserve">PostgreSQL via Prisma ORM (Prisma Postgres / Supabase)</w:t>
-            </w:r>
-          </w:p>
-        </w:tc>
-      </w:tr>
-      <w:tr>
-        <w:tc>
-          <w:tcPr>
-            <w:tcW w:type="pct" w:w="30%"/>
-            <w:shd w:fill="FFFFFF" w:val="solid"/>
-            <w:tcMar>
-              <w:top w:type="dxa" w:w="80"/>
-              <w:left w:type="dxa" w:w="120"/>
-              <w:bottom w:type="dxa" w:w="80"/>
-              <w:right w:type="dxa" w:w="120"/>
-            </w:tcMar>
-          </w:tcPr>
-          <w:p>
-            <w:r>
-              <w:rPr>
-                <w:sz w:val="20"/>
-                <w:szCs w:val="20"/>
-              </w:rPr>
-              <w:t xml:space="preserve">Authentication</w:t>
-            </w:r>
-          </w:p>
-        </w:tc>
-        <w:tc>
-          <w:tcPr>
-            <w:tcW w:type="pct" w:w="70%"/>
-            <w:shd w:fill="FFFFFF" w:val="solid"/>
-            <w:tcMar>
-              <w:top w:type="dxa" w:w="80"/>
-              <w:left w:type="dxa" w:w="120"/>
-              <w:bottom w:type="dxa" w:w="80"/>
-              <w:right w:type="dxa" w:w="120"/>
-            </w:tcMar>
-          </w:tcPr>
-          <w:p>
-            <w:r>
-              <w:rPr>
-                <w:sz w:val="20"/>
-                <w:szCs w:val="20"/>
-              </w:rPr>
-              <w:t xml:space="preserve">Clerk (email/password, SSO-ready)</w:t>
-            </w:r>
-          </w:p>
-        </w:tc>
-      </w:tr>
-      <w:tr>
-        <w:tc>
-          <w:tcPr>
-            <w:tcW w:type="pct" w:w="30%"/>
-            <w:shd w:fill="EBF0F7" w:val="solid"/>
-            <w:tcMar>
-              <w:top w:type="dxa" w:w="80"/>
-              <w:left w:type="dxa" w:w="120"/>
-              <w:bottom w:type="dxa" w:w="80"/>
-              <w:right w:type="dxa" w:w="120"/>
-            </w:tcMar>
-          </w:tcPr>
-          <w:p>
-            <w:r>
-              <w:rPr>
-                <w:sz w:val="20"/>
-                <w:szCs w:val="20"/>
-              </w:rPr>
-              <w:t xml:space="preserve">Email</w:t>
-            </w:r>
-          </w:p>
-        </w:tc>
-        <w:tc>
-          <w:tcPr>
-            <w:tcW w:type="pct" w:w="70%"/>
-            <w:shd w:fill="EBF0F7" w:val="solid"/>
-            <w:tcMar>
-              <w:top w:type="dxa" w:w="80"/>
-              <w:left w:type="dxa" w:w="120"/>
-              <w:bottom w:type="dxa" w:w="80"/>
-              <w:right w:type="dxa" w:w="120"/>
-            </w:tcMar>
-          </w:tcPr>
-          <w:p>
-            <w:r>
-              <w:rPr>
-                <w:sz w:val="20"/>
-                <w:szCs w:val="20"/>
-              </w:rPr>
-              <w:t xml:space="preserve">Nodemailer with Gmail SMTP</w:t>
-            </w:r>
-          </w:p>
-        </w:tc>
-      </w:tr>
-      <w:tr>
-        <w:tc>
-          <w:tcPr>
-            <w:tcW w:type="pct" w:w="30%"/>
-            <w:shd w:fill="FFFFFF" w:val="solid"/>
-            <w:tcMar>
-              <w:top w:type="dxa" w:w="80"/>
-              <w:left w:type="dxa" w:w="120"/>
-              <w:bottom w:type="dxa" w:w="80"/>
-              <w:right w:type="dxa" w:w="120"/>
-            </w:tcMar>
-          </w:tcPr>
-          <w:p>
-            <w:r>
-              <w:rPr>
-                <w:sz w:val="20"/>
-                <w:szCs w:val="20"/>
-              </w:rPr>
-              <w:t xml:space="preserve">Distance API</w:t>
-            </w:r>
-          </w:p>
-        </w:tc>
-        <w:tc>
-          <w:tcPr>
-            <w:tcW w:type="pct" w:w="70%"/>
-            <w:shd w:fill="FFFFFF" w:val="solid"/>
-            <w:tcMar>
-              <w:top w:type="dxa" w:w="80"/>
-              <w:left w:type="dxa" w:w="120"/>
-              <w:bottom w:type="dxa" w:w="80"/>
-              <w:right w:type="dxa" w:w="120"/>
-            </w:tcMar>
-          </w:tcPr>
-          <w:p>
-            <w:r>
-              <w:rPr>
-                <w:sz w:val="20"/>
-                <w:szCs w:val="20"/>
-              </w:rPr>
-              <w:t xml:space="preserve">Google Maps Distance Matrix API</w:t>
-            </w:r>
-          </w:p>
-        </w:tc>
-      </w:tr>
-      <w:tr>
-        <w:tc>
-          <w:tcPr>
-            <w:tcW w:type="pct" w:w="30%"/>
-            <w:shd w:fill="EBF0F7" w:val="solid"/>
-            <w:tcMar>
-              <w:top w:type="dxa" w:w="80"/>
-              <w:left w:type="dxa" w:w="120"/>
-              <w:bottom w:type="dxa" w:w="80"/>
-              <w:right w:type="dxa" w:w="120"/>
-            </w:tcMar>
-          </w:tcPr>
-          <w:p>
-            <w:r>
-              <w:rPr>
-                <w:sz w:val="20"/>
-                <w:szCs w:val="20"/>
-              </w:rPr>
-              <w:t xml:space="preserve">Excel Export</w:t>
-            </w:r>
-          </w:p>
-        </w:tc>
-        <w:tc>
-          <w:tcPr>
-            <w:tcW w:type="pct" w:w="70%"/>
-            <w:shd w:fill="EBF0F7" w:val="solid"/>
-            <w:tcMar>
-              <w:top w:type="dxa" w:w="80"/>
-              <w:left w:type="dxa" w:w="120"/>
-              <w:bottom w:type="dxa" w:w="80"/>
-              <w:right w:type="dxa" w:w="120"/>
-            </w:tcMar>
-          </w:tcPr>
-          <w:p>
-            <w:r>
-              <w:rPr>
-                <w:sz w:val="20"/>
-                <w:szCs w:val="20"/>
-              </w:rPr>
-              <w:t xml:space="preserve">ExcelJS</w:t>
-            </w:r>
-          </w:p>
-        </w:tc>
-      </w:tr>
-      <w:tr>
-        <w:tc>
-          <w:tcPr>
-            <w:tcW w:type="pct" w:w="30%"/>
-            <w:shd w:fill="FFFFFF" w:val="solid"/>
-            <w:tcMar>
-              <w:top w:type="dxa" w:w="80"/>
-              <w:left w:type="dxa" w:w="120"/>
-              <w:bottom w:type="dxa" w:w="80"/>
-              <w:right w:type="dxa" w:w="120"/>
-            </w:tcMar>
-          </w:tcPr>
-          <w:p>
-            <w:r>
-              <w:rPr>
-                <w:sz w:val="20"/>
-                <w:szCs w:val="20"/>
-              </w:rPr>
-              <w:t xml:space="preserve">UI Components</w:t>
-            </w:r>
-          </w:p>
-        </w:tc>
-        <w:tc>
-          <w:tcPr>
-            <w:tcW w:type="pct" w:w="70%"/>
-            <w:shd w:fill="FFFFFF" w:val="solid"/>
-            <w:tcMar>
-              <w:top w:type="dxa" w:w="80"/>
-              <w:left w:type="dxa" w:w="120"/>
-              <w:bottom w:type="dxa" w:w="80"/>
-              <w:right w:type="dxa" w:w="120"/>
-            </w:tcMar>
-          </w:tcPr>
-          <w:p>
-            <w:r>
-              <w:rPr>
-                <w:sz w:val="20"/>
-                <w:szCs w:val="20"/>
-              </w:rPr>
-              <w:t xml:space="preserve">Tailwind CSS + Radix UI (shadcn/ui)</w:t>
-            </w:r>
-          </w:p>
-        </w:tc>
-      </w:tr>
-      <w:tr>
-        <w:tc>
-          <w:tcPr>
-            <w:tcW w:type="pct" w:w="30%"/>
-            <w:shd w:fill="EBF0F7" w:val="solid"/>
-            <w:tcMar>
-              <w:top w:type="dxa" w:w="80"/>
-              <w:left w:type="dxa" w:w="120"/>
-              <w:bottom w:type="dxa" w:w="80"/>
-              <w:right w:type="dxa" w:w="120"/>
-            </w:tcMar>
-          </w:tcPr>
-          <w:p>
-            <w:r>
-              <w:rPr>
-                <w:sz w:val="20"/>
-                <w:szCs w:val="20"/>
-              </w:rPr>
-              <w:t xml:space="preserve">Hosting</w:t>
-            </w:r>
-          </w:p>
-        </w:tc>
-        <w:tc>
-          <w:tcPr>
-            <w:tcW w:type="pct" w:w="70%"/>
-            <w:shd w:fill="EBF0F7" w:val="solid"/>
-            <w:tcMar>
-              <w:top w:type="dxa" w:w="80"/>
-              <w:left w:type="dxa" w:w="120"/>
-              <w:bottom w:type="dxa" w:w="80"/>
-              <w:right w:type="dxa" w:w="120"/>
-            </w:tcMar>
-          </w:tcPr>
-          <w:p>
-            <w:r>
-              <w:rPr>
-                <w:sz w:val="20"/>
-                <w:szCs w:val="20"/>
-              </w:rPr>
-              <w:t xml:space="preserve">Vercel (auto-deploy from main branch)</w:t>
-            </w:r>
-          </w:p>
-        </w:tc>
-      </w:tr>
-    </w:tbl>
-    <w:p>
-      <w:pPr>
-        <w:spacing w:after="160"/>
-      </w:pPr>
-    </w:p>
-    <w:p>
-      <w:pPr>
-        <w:pStyle w:val="Heading2"/>
-        <w:spacing w:after="120" w:before="320"/>
-      </w:pPr>
-      <w:r>
-        <w:rPr>
-          <w:b/>
-          <w:bCs/>
-          <w:color w:val="1E3A5F"/>
-          <w:sz w:val="28"/>
-          <w:szCs w:val="28"/>
-        </w:rPr>
-        <w:t xml:space="preserve">1.3  Access URL</w:t>
-      </w:r>
-    </w:p>
-    <w:p>
-      <w:pPr>
-        <w:spacing w:after="120"/>
-      </w:pPr>
-      <w:r>
-        <w:rPr>
-          <w:sz w:val="22"/>
-          <w:szCs w:val="22"/>
-        </w:rPr>
-        <w:t xml:space="preserve">The application is hosted at the URL configured in the NEXT_PUBLIC_APP_URL environment variable. Contact the Application Owner for the current production URL.</w:t>
-      </w:r>
-    </w:p>
-    <w:p>
-      <w:r>
-        <w:br w:type="page"/>
-      </w:r>
-    </w:p>
-    <w:p>
-      <w:pPr>
-        <w:pStyle w:val="Heading1"/>
-        <w:spacing w:after="160" w:before="480"/>
-      </w:pPr>
-      <w:r>
-        <w:rPr>
-          <w:b/>
-          <w:bCs/>
-          <w:color w:val="1E3A5F"/>
-          <w:sz w:val="36"/>
-          <w:szCs w:val="36"/>
-        </w:rPr>
-        <w:t xml:space="preserve">2. User Roles &amp; Permissions</w:t>
-      </w:r>
-    </w:p>
-    <w:p>
-      <w:pPr>
-        <w:pBdr>
-          <w:bottom w:val="single" w:color="1E3A5F" w:sz="6"/>
-        </w:pBdr>
-        <w:spacing w:after="160"/>
-      </w:pPr>
-    </w:p>
-    <w:p>
-      <w:pPr>
-        <w:spacing w:after="120"/>
-      </w:pPr>
-      <w:r>
-        <w:rPr>
-          <w:sz w:val="22"/>
-          <w:szCs w:val="22"/>
-        </w:rPr>
-        <w:t xml:space="preserve">The system has four roles arranged in a hierarchy. Each higher role inherits all permissions of the roles below it.</w:t>
-      </w:r>
-    </w:p>
-    <w:p>
-      <w:pPr>
-        <w:spacing w:after="160"/>
-      </w:pPr>
     </w:p>
     <w:tbl>
       <w:tblPr>
@@ -851,7 +113,7 @@
         </w:trPr>
         <w:tc>
           <w:tcPr>
-            <w:tcW w:type="pct" w:w="18%"/>
+            <w:tcW w:type="pct" w:w="30%"/>
             <w:shd w:fill="1E3A5F" w:val="solid"/>
             <w:tcMar>
               <w:top w:type="dxa" w:w="80"/>
@@ -878,7 +140,7 @@
         </w:tc>
         <w:tc>
           <w:tcPr>
-            <w:tcW w:type="pct" w:w="32%"/>
+            <w:tcW w:type="pct" w:w="35%"/>
             <w:shd w:fill="1E3A5F" w:val="solid"/>
             <w:tcMar>
               <w:top w:type="dxa" w:w="80"/>
@@ -899,13 +161,13 @@
                 <w:sz w:val="20"/>
                 <w:szCs w:val="20"/>
               </w:rPr>
-              <w:t xml:space="preserve">Description</w:t>
-            </w:r>
-          </w:p>
-        </w:tc>
-        <w:tc>
-          <w:tcPr>
-            <w:tcW w:type="pct" w:w="50%"/>
+              <w:t xml:space="preserve">Name</w:t>
+            </w:r>
+          </w:p>
+        </w:tc>
+        <w:tc>
+          <w:tcPr>
+            <w:tcW w:type="pct" w:w="35%"/>
             <w:shd w:fill="1E3A5F" w:val="solid"/>
             <w:tcMar>
               <w:top w:type="dxa" w:w="80"/>
@@ -926,6 +188,918 @@
                 <w:sz w:val="20"/>
                 <w:szCs w:val="20"/>
               </w:rPr>
+              <w:t xml:space="preserve">Email</w:t>
+            </w:r>
+          </w:p>
+        </w:tc>
+      </w:tr>
+      <w:tr>
+        <w:tc>
+          <w:tcPr>
+            <w:tcW w:type="pct" w:w="30%"/>
+            <w:shd w:fill="FFFFFF" w:val="solid"/>
+            <w:tcMar>
+              <w:top w:type="dxa" w:w="80"/>
+              <w:left w:type="dxa" w:w="120"/>
+              <w:bottom w:type="dxa" w:w="80"/>
+              <w:right w:type="dxa" w:w="120"/>
+            </w:tcMar>
+          </w:tcPr>
+          <w:p>
+            <w:r>
+              <w:rPr>
+                <w:sz w:val="20"/>
+                <w:szCs w:val="20"/>
+              </w:rPr>
+              <w:t xml:space="preserve">Application Owner</w:t>
+            </w:r>
+          </w:p>
+        </w:tc>
+        <w:tc>
+          <w:tcPr>
+            <w:tcW w:type="pct" w:w="35%"/>
+            <w:shd w:fill="FFFFFF" w:val="solid"/>
+            <w:tcMar>
+              <w:top w:type="dxa" w:w="80"/>
+              <w:left w:type="dxa" w:w="120"/>
+              <w:bottom w:type="dxa" w:w="80"/>
+              <w:right w:type="dxa" w:w="120"/>
+            </w:tcMar>
+          </w:tcPr>
+          <w:p>
+            <w:r>
+              <w:rPr>
+                <w:sz w:val="20"/>
+                <w:szCs w:val="20"/>
+              </w:rPr>
+              <w:t xml:space="preserve">Michael Pisano</w:t>
+            </w:r>
+          </w:p>
+        </w:tc>
+        <w:tc>
+          <w:tcPr>
+            <w:tcW w:type="pct" w:w="35%"/>
+            <w:shd w:fill="FFFFFF" w:val="solid"/>
+            <w:tcMar>
+              <w:top w:type="dxa" w:w="80"/>
+              <w:left w:type="dxa" w:w="120"/>
+              <w:bottom w:type="dxa" w:w="80"/>
+              <w:right w:type="dxa" w:w="120"/>
+            </w:tcMar>
+          </w:tcPr>
+          <w:p>
+            <w:r>
+              <w:rPr>
+                <w:sz w:val="20"/>
+                <w:szCs w:val="20"/>
+              </w:rPr>
+              <w:t xml:space="preserve">mpisano@riverwestpartners.com</w:t>
+            </w:r>
+          </w:p>
+        </w:tc>
+      </w:tr>
+    </w:tbl>
+    <w:p>
+      <w:pPr>
+        <w:spacing w:after="160"/>
+      </w:pPr>
+    </w:p>
+    <w:p>
+      <w:r>
+        <w:br w:type="page"/>
+      </w:r>
+    </w:p>
+    <w:p>
+      <w:pPr>
+        <w:pStyle w:val="Heading1"/>
+        <w:spacing w:after="160" w:before="480"/>
+      </w:pPr>
+      <w:r>
+        <w:rPr>
+          <w:b/>
+          <w:bCs/>
+          <w:color w:val="1E3A5F"/>
+          <w:sz w:val="36"/>
+          <w:szCs w:val="36"/>
+        </w:rPr>
+        <w:t xml:space="preserve">1. System Overview</w:t>
+      </w:r>
+    </w:p>
+    <w:p>
+      <w:pPr>
+        <w:pBdr>
+          <w:bottom w:val="single" w:color="1E3A5F" w:sz="6"/>
+        </w:pBdr>
+        <w:spacing w:after="160"/>
+      </w:pPr>
+    </w:p>
+    <w:p>
+      <w:pPr>
+        <w:spacing w:after="120"/>
+      </w:pPr>
+      <w:r>
+        <w:rPr>
+          <w:sz w:val="22"/>
+          <w:szCs w:val="22"/>
+        </w:rPr>
+        <w:t xml:space="preserve">The RiverWest Travel &amp; Mileage Reporting System is a web application that allows RiverWest Properties employees to record business trips, calculate mileage reimbursements, and submit expense reports through a structured multi-step approval workflow.</w:t>
+      </w:r>
+    </w:p>
+    <w:p>
+      <w:pPr>
+        <w:spacing w:after="120"/>
+      </w:pPr>
+      <w:r>
+        <w:rPr>
+          <w:sz w:val="22"/>
+          <w:szCs w:val="22"/>
+        </w:rPr>
+        <w:t xml:space="preserve">Once an approver approves a report, an Excel summary is automatically emailed to the accounting team — eliminating manual spreadsheet work and providing a complete, auditable record of all reimbursements.</w:t>
+      </w:r>
+    </w:p>
+    <w:p>
+      <w:pPr>
+        <w:spacing w:after="160"/>
+      </w:pPr>
+    </w:p>
+    <w:p>
+      <w:pPr>
+        <w:pStyle w:val="Heading2"/>
+        <w:spacing w:after="120" w:before="320"/>
+      </w:pPr>
+      <w:r>
+        <w:rPr>
+          <w:b/>
+          <w:bCs/>
+          <w:color w:val="1E3A5F"/>
+          <w:sz w:val="28"/>
+          <w:szCs w:val="28"/>
+        </w:rPr>
+        <w:t xml:space="preserve">1.1  Key Capabilities</w:t>
+      </w:r>
+    </w:p>
+    <w:p>
+      <w:pPr>
+        <w:pStyle w:val="ListParagraph"/>
+        <w:numPr>
+          <w:ilvl w:val="0"/>
+          <w:numId w:val="1"/>
+        </w:numPr>
+        <w:spacing w:after="80"/>
+      </w:pPr>
+      <w:r>
+        <w:rPr>
+          <w:sz w:val="22"/>
+          <w:szCs w:val="22"/>
+        </w:rPr>
+        <w:t xml:space="preserve">Employees log trips by selecting origin and destination properties or addresses</w:t>
+      </w:r>
+    </w:p>
+    <w:p>
+      <w:pPr>
+        <w:pStyle w:val="ListParagraph"/>
+        <w:numPr>
+          <w:ilvl w:val="0"/>
+          <w:numId w:val="1"/>
+        </w:numPr>
+        <w:spacing w:after="80"/>
+      </w:pPr>
+      <w:r>
+        <w:rPr>
+          <w:sz w:val="22"/>
+          <w:szCs w:val="22"/>
+        </w:rPr>
+        <w:t xml:space="preserve">Distance is calculated automatically via the Google Maps Distance Matrix API</w:t>
+      </w:r>
+    </w:p>
+    <w:p>
+      <w:pPr>
+        <w:pStyle w:val="ListParagraph"/>
+        <w:numPr>
+          <w:ilvl w:val="0"/>
+          <w:numId w:val="1"/>
+        </w:numPr>
+        <w:spacing w:after="80"/>
+      </w:pPr>
+      <w:r>
+        <w:rPr>
+          <w:sz w:val="22"/>
+          <w:szCs w:val="22"/>
+        </w:rPr>
+        <w:t xml:space="preserve">Reports are submitted to one or more assigned approvers for review</w:t>
+      </w:r>
+    </w:p>
+    <w:p>
+      <w:pPr>
+        <w:pStyle w:val="ListParagraph"/>
+        <w:numPr>
+          <w:ilvl w:val="0"/>
+          <w:numId w:val="1"/>
+        </w:numPr>
+        <w:spacing w:after="80"/>
+      </w:pPr>
+      <w:r>
+        <w:rPr>
+          <w:sz w:val="22"/>
+          <w:szCs w:val="22"/>
+        </w:rPr>
+        <w:t xml:space="preserve">Approvers can annotate individual trips with notes and approve or return for revision</w:t>
+      </w:r>
+    </w:p>
+    <w:p>
+      <w:pPr>
+        <w:pStyle w:val="ListParagraph"/>
+        <w:numPr>
+          <w:ilvl w:val="0"/>
+          <w:numId w:val="1"/>
+        </w:numPr>
+        <w:spacing w:after="80"/>
+      </w:pPr>
+      <w:r>
+        <w:rPr>
+          <w:sz w:val="22"/>
+          <w:szCs w:val="22"/>
+        </w:rPr>
+        <w:t xml:space="preserve">Approved reports are exported as a formatted Excel workbook and emailed to accounting</w:t>
+      </w:r>
+    </w:p>
+    <w:p>
+      <w:pPr>
+        <w:pStyle w:val="ListParagraph"/>
+        <w:numPr>
+          <w:ilvl w:val="0"/>
+          <w:numId w:val="1"/>
+        </w:numPr>
+        <w:spacing w:after="80"/>
+      </w:pPr>
+      <w:r>
+        <w:rPr>
+          <w:sz w:val="22"/>
+          <w:szCs w:val="22"/>
+        </w:rPr>
+        <w:t xml:space="preserve">Mileage reimbursement rates are managed in the application by the Application Owner</w:t>
+      </w:r>
+    </w:p>
+    <w:p>
+      <w:pPr>
+        <w:pStyle w:val="ListParagraph"/>
+        <w:numPr>
+          <w:ilvl w:val="0"/>
+          <w:numId w:val="1"/>
+        </w:numPr>
+        <w:spacing w:after="80"/>
+      </w:pPr>
+      <w:r>
+        <w:rPr>
+          <w:sz w:val="22"/>
+          <w:szCs w:val="22"/>
+        </w:rPr>
+        <w:t xml:space="preserve">New user accounts require activation by the Application Owner before access is granted</w:t>
+      </w:r>
+    </w:p>
+    <w:p>
+      <w:pPr>
+        <w:pStyle w:val="ListParagraph"/>
+        <w:numPr>
+          <w:ilvl w:val="0"/>
+          <w:numId w:val="1"/>
+        </w:numPr>
+        <w:spacing w:after="80"/>
+      </w:pPr>
+      <w:r>
+        <w:rPr>
+          <w:sz w:val="22"/>
+          <w:szCs w:val="22"/>
+        </w:rPr>
+        <w:t xml:space="preserve">Soft-deleted reports are retained in a log accessible to the Application Owner</w:t>
+      </w:r>
+    </w:p>
+    <w:p>
+      <w:pPr>
+        <w:spacing w:after="160"/>
+      </w:pPr>
+    </w:p>
+    <w:p>
+      <w:pPr>
+        <w:pStyle w:val="Heading2"/>
+        <w:spacing w:after="120" w:before="320"/>
+      </w:pPr>
+      <w:r>
+        <w:rPr>
+          <w:b/>
+          <w:bCs/>
+          <w:color w:val="1E3A5F"/>
+          <w:sz w:val="28"/>
+          <w:szCs w:val="28"/>
+        </w:rPr>
+        <w:t xml:space="preserve">1.2  Technology Stack</w:t>
+      </w:r>
+    </w:p>
+    <w:tbl>
+      <w:tblPr>
+        <w:tblW w:type="pct" w:w="100%"/>
+        <w:tblBorders>
+          <w:top w:val="single" w:color="auto" w:sz="4"/>
+          <w:left w:val="single" w:color="auto" w:sz="4"/>
+          <w:bottom w:val="single" w:color="auto" w:sz="4"/>
+          <w:right w:val="single" w:color="auto" w:sz="4"/>
+          <w:insideH w:val="single" w:color="auto" w:sz="4"/>
+          <w:insideV w:val="single" w:color="auto" w:sz="4"/>
+        </w:tblBorders>
+      </w:tblPr>
+      <w:tblGrid>
+        <w:gridCol w:w="100"/>
+        <w:gridCol w:w="100"/>
+      </w:tblGrid>
+      <w:tr>
+        <w:trPr>
+          <w:tblHeader/>
+        </w:trPr>
+        <w:tc>
+          <w:tcPr>
+            <w:tcW w:type="pct" w:w="30%"/>
+            <w:shd w:fill="1E3A5F" w:val="solid"/>
+            <w:tcMar>
+              <w:top w:type="dxa" w:w="80"/>
+              <w:left w:type="dxa" w:w="120"/>
+              <w:bottom w:type="dxa" w:w="80"/>
+              <w:right w:type="dxa" w:w="120"/>
+            </w:tcMar>
+          </w:tcPr>
+          <w:p>
+            <w:pPr>
+              <w:jc w:val="left"/>
+            </w:pPr>
+            <w:r>
+              <w:rPr>
+                <w:b/>
+                <w:bCs/>
+                <w:color w:val="FFFFFF"/>
+                <w:sz w:val="20"/>
+                <w:szCs w:val="20"/>
+              </w:rPr>
+              <w:t xml:space="preserve">Component</w:t>
+            </w:r>
+          </w:p>
+        </w:tc>
+        <w:tc>
+          <w:tcPr>
+            <w:tcW w:type="pct" w:w="70%"/>
+            <w:shd w:fill="1E3A5F" w:val="solid"/>
+            <w:tcMar>
+              <w:top w:type="dxa" w:w="80"/>
+              <w:left w:type="dxa" w:w="120"/>
+              <w:bottom w:type="dxa" w:w="80"/>
+              <w:right w:type="dxa" w:w="120"/>
+            </w:tcMar>
+          </w:tcPr>
+          <w:p>
+            <w:pPr>
+              <w:jc w:val="left"/>
+            </w:pPr>
+            <w:r>
+              <w:rPr>
+                <w:b/>
+                <w:bCs/>
+                <w:color w:val="FFFFFF"/>
+                <w:sz w:val="20"/>
+                <w:szCs w:val="20"/>
+              </w:rPr>
+              <w:t xml:space="preserve">Technology</w:t>
+            </w:r>
+          </w:p>
+        </w:tc>
+      </w:tr>
+      <w:tr>
+        <w:tc>
+          <w:tcPr>
+            <w:tcW w:type="pct" w:w="30%"/>
+            <w:shd w:fill="FFFFFF" w:val="solid"/>
+            <w:tcMar>
+              <w:top w:type="dxa" w:w="80"/>
+              <w:left w:type="dxa" w:w="120"/>
+              <w:bottom w:type="dxa" w:w="80"/>
+              <w:right w:type="dxa" w:w="120"/>
+            </w:tcMar>
+          </w:tcPr>
+          <w:p>
+            <w:r>
+              <w:rPr>
+                <w:sz w:val="20"/>
+                <w:szCs w:val="20"/>
+              </w:rPr>
+              <w:t xml:space="preserve">Framework</w:t>
+            </w:r>
+          </w:p>
+        </w:tc>
+        <w:tc>
+          <w:tcPr>
+            <w:tcW w:type="pct" w:w="70%"/>
+            <w:shd w:fill="FFFFFF" w:val="solid"/>
+            <w:tcMar>
+              <w:top w:type="dxa" w:w="80"/>
+              <w:left w:type="dxa" w:w="120"/>
+              <w:bottom w:type="dxa" w:w="80"/>
+              <w:right w:type="dxa" w:w="120"/>
+            </w:tcMar>
+          </w:tcPr>
+          <w:p>
+            <w:r>
+              <w:rPr>
+                <w:sz w:val="20"/>
+                <w:szCs w:val="20"/>
+              </w:rPr>
+              <w:t xml:space="preserve">Next.js 14 (App Router, React Server Components)</w:t>
+            </w:r>
+          </w:p>
+        </w:tc>
+      </w:tr>
+      <w:tr>
+        <w:tc>
+          <w:tcPr>
+            <w:tcW w:type="pct" w:w="30%"/>
+            <w:shd w:fill="EBF0F7" w:val="solid"/>
+            <w:tcMar>
+              <w:top w:type="dxa" w:w="80"/>
+              <w:left w:type="dxa" w:w="120"/>
+              <w:bottom w:type="dxa" w:w="80"/>
+              <w:right w:type="dxa" w:w="120"/>
+            </w:tcMar>
+          </w:tcPr>
+          <w:p>
+            <w:r>
+              <w:rPr>
+                <w:sz w:val="20"/>
+                <w:szCs w:val="20"/>
+              </w:rPr>
+              <w:t xml:space="preserve">Database</w:t>
+            </w:r>
+          </w:p>
+        </w:tc>
+        <w:tc>
+          <w:tcPr>
+            <w:tcW w:type="pct" w:w="70%"/>
+            <w:shd w:fill="EBF0F7" w:val="solid"/>
+            <w:tcMar>
+              <w:top w:type="dxa" w:w="80"/>
+              <w:left w:type="dxa" w:w="120"/>
+              <w:bottom w:type="dxa" w:w="80"/>
+              <w:right w:type="dxa" w:w="120"/>
+            </w:tcMar>
+          </w:tcPr>
+          <w:p>
+            <w:r>
+              <w:rPr>
+                <w:sz w:val="20"/>
+                <w:szCs w:val="20"/>
+              </w:rPr>
+              <w:t xml:space="preserve">PostgreSQL via Prisma ORM (Prisma Postgres / Supabase)</w:t>
+            </w:r>
+          </w:p>
+        </w:tc>
+      </w:tr>
+      <w:tr>
+        <w:tc>
+          <w:tcPr>
+            <w:tcW w:type="pct" w:w="30%"/>
+            <w:shd w:fill="FFFFFF" w:val="solid"/>
+            <w:tcMar>
+              <w:top w:type="dxa" w:w="80"/>
+              <w:left w:type="dxa" w:w="120"/>
+              <w:bottom w:type="dxa" w:w="80"/>
+              <w:right w:type="dxa" w:w="120"/>
+            </w:tcMar>
+          </w:tcPr>
+          <w:p>
+            <w:r>
+              <w:rPr>
+                <w:sz w:val="20"/>
+                <w:szCs w:val="20"/>
+              </w:rPr>
+              <w:t xml:space="preserve">Authentication</w:t>
+            </w:r>
+          </w:p>
+        </w:tc>
+        <w:tc>
+          <w:tcPr>
+            <w:tcW w:type="pct" w:w="70%"/>
+            <w:shd w:fill="FFFFFF" w:val="solid"/>
+            <w:tcMar>
+              <w:top w:type="dxa" w:w="80"/>
+              <w:left w:type="dxa" w:w="120"/>
+              <w:bottom w:type="dxa" w:w="80"/>
+              <w:right w:type="dxa" w:w="120"/>
+            </w:tcMar>
+          </w:tcPr>
+          <w:p>
+            <w:r>
+              <w:rPr>
+                <w:sz w:val="20"/>
+                <w:szCs w:val="20"/>
+              </w:rPr>
+              <w:t xml:space="preserve">Clerk (email/password, SSO-ready)</w:t>
+            </w:r>
+          </w:p>
+        </w:tc>
+      </w:tr>
+      <w:tr>
+        <w:tc>
+          <w:tcPr>
+            <w:tcW w:type="pct" w:w="30%"/>
+            <w:shd w:fill="EBF0F7" w:val="solid"/>
+            <w:tcMar>
+              <w:top w:type="dxa" w:w="80"/>
+              <w:left w:type="dxa" w:w="120"/>
+              <w:bottom w:type="dxa" w:w="80"/>
+              <w:right w:type="dxa" w:w="120"/>
+            </w:tcMar>
+          </w:tcPr>
+          <w:p>
+            <w:r>
+              <w:rPr>
+                <w:sz w:val="20"/>
+                <w:szCs w:val="20"/>
+              </w:rPr>
+              <w:t xml:space="preserve">Email</w:t>
+            </w:r>
+          </w:p>
+        </w:tc>
+        <w:tc>
+          <w:tcPr>
+            <w:tcW w:type="pct" w:w="70%"/>
+            <w:shd w:fill="EBF0F7" w:val="solid"/>
+            <w:tcMar>
+              <w:top w:type="dxa" w:w="80"/>
+              <w:left w:type="dxa" w:w="120"/>
+              <w:bottom w:type="dxa" w:w="80"/>
+              <w:right w:type="dxa" w:w="120"/>
+            </w:tcMar>
+          </w:tcPr>
+          <w:p>
+            <w:r>
+              <w:rPr>
+                <w:sz w:val="20"/>
+                <w:szCs w:val="20"/>
+              </w:rPr>
+              <w:t xml:space="preserve">Nodemailer with Gmail SMTP</w:t>
+            </w:r>
+          </w:p>
+        </w:tc>
+      </w:tr>
+      <w:tr>
+        <w:tc>
+          <w:tcPr>
+            <w:tcW w:type="pct" w:w="30%"/>
+            <w:shd w:fill="FFFFFF" w:val="solid"/>
+            <w:tcMar>
+              <w:top w:type="dxa" w:w="80"/>
+              <w:left w:type="dxa" w:w="120"/>
+              <w:bottom w:type="dxa" w:w="80"/>
+              <w:right w:type="dxa" w:w="120"/>
+            </w:tcMar>
+          </w:tcPr>
+          <w:p>
+            <w:r>
+              <w:rPr>
+                <w:sz w:val="20"/>
+                <w:szCs w:val="20"/>
+              </w:rPr>
+              <w:t xml:space="preserve">Distance API</w:t>
+            </w:r>
+          </w:p>
+        </w:tc>
+        <w:tc>
+          <w:tcPr>
+            <w:tcW w:type="pct" w:w="70%"/>
+            <w:shd w:fill="FFFFFF" w:val="solid"/>
+            <w:tcMar>
+              <w:top w:type="dxa" w:w="80"/>
+              <w:left w:type="dxa" w:w="120"/>
+              <w:bottom w:type="dxa" w:w="80"/>
+              <w:right w:type="dxa" w:w="120"/>
+            </w:tcMar>
+          </w:tcPr>
+          <w:p>
+            <w:r>
+              <w:rPr>
+                <w:sz w:val="20"/>
+                <w:szCs w:val="20"/>
+              </w:rPr>
+              <w:t xml:space="preserve">Google Maps Distance Matrix API</w:t>
+            </w:r>
+          </w:p>
+        </w:tc>
+      </w:tr>
+      <w:tr>
+        <w:tc>
+          <w:tcPr>
+            <w:tcW w:type="pct" w:w="30%"/>
+            <w:shd w:fill="EBF0F7" w:val="solid"/>
+            <w:tcMar>
+              <w:top w:type="dxa" w:w="80"/>
+              <w:left w:type="dxa" w:w="120"/>
+              <w:bottom w:type="dxa" w:w="80"/>
+              <w:right w:type="dxa" w:w="120"/>
+            </w:tcMar>
+          </w:tcPr>
+          <w:p>
+            <w:r>
+              <w:rPr>
+                <w:sz w:val="20"/>
+                <w:szCs w:val="20"/>
+              </w:rPr>
+              <w:t xml:space="preserve">Excel Export</w:t>
+            </w:r>
+          </w:p>
+        </w:tc>
+        <w:tc>
+          <w:tcPr>
+            <w:tcW w:type="pct" w:w="70%"/>
+            <w:shd w:fill="EBF0F7" w:val="solid"/>
+            <w:tcMar>
+              <w:top w:type="dxa" w:w="80"/>
+              <w:left w:type="dxa" w:w="120"/>
+              <w:bottom w:type="dxa" w:w="80"/>
+              <w:right w:type="dxa" w:w="120"/>
+            </w:tcMar>
+          </w:tcPr>
+          <w:p>
+            <w:r>
+              <w:rPr>
+                <w:sz w:val="20"/>
+                <w:szCs w:val="20"/>
+              </w:rPr>
+              <w:t xml:space="preserve">ExcelJS</w:t>
+            </w:r>
+          </w:p>
+        </w:tc>
+      </w:tr>
+      <w:tr>
+        <w:tc>
+          <w:tcPr>
+            <w:tcW w:type="pct" w:w="30%"/>
+            <w:shd w:fill="FFFFFF" w:val="solid"/>
+            <w:tcMar>
+              <w:top w:type="dxa" w:w="80"/>
+              <w:left w:type="dxa" w:w="120"/>
+              <w:bottom w:type="dxa" w:w="80"/>
+              <w:right w:type="dxa" w:w="120"/>
+            </w:tcMar>
+          </w:tcPr>
+          <w:p>
+            <w:r>
+              <w:rPr>
+                <w:sz w:val="20"/>
+                <w:szCs w:val="20"/>
+              </w:rPr>
+              <w:t xml:space="preserve">UI Components</w:t>
+            </w:r>
+          </w:p>
+        </w:tc>
+        <w:tc>
+          <w:tcPr>
+            <w:tcW w:type="pct" w:w="70%"/>
+            <w:shd w:fill="FFFFFF" w:val="solid"/>
+            <w:tcMar>
+              <w:top w:type="dxa" w:w="80"/>
+              <w:left w:type="dxa" w:w="120"/>
+              <w:bottom w:type="dxa" w:w="80"/>
+              <w:right w:type="dxa" w:w="120"/>
+            </w:tcMar>
+          </w:tcPr>
+          <w:p>
+            <w:r>
+              <w:rPr>
+                <w:sz w:val="20"/>
+                <w:szCs w:val="20"/>
+              </w:rPr>
+              <w:t xml:space="preserve">Tailwind CSS + Radix UI (shadcn/ui)</w:t>
+            </w:r>
+          </w:p>
+        </w:tc>
+      </w:tr>
+      <w:tr>
+        <w:tc>
+          <w:tcPr>
+            <w:tcW w:type="pct" w:w="30%"/>
+            <w:shd w:fill="EBF0F7" w:val="solid"/>
+            <w:tcMar>
+              <w:top w:type="dxa" w:w="80"/>
+              <w:left w:type="dxa" w:w="120"/>
+              <w:bottom w:type="dxa" w:w="80"/>
+              <w:right w:type="dxa" w:w="120"/>
+            </w:tcMar>
+          </w:tcPr>
+          <w:p>
+            <w:r>
+              <w:rPr>
+                <w:sz w:val="20"/>
+                <w:szCs w:val="20"/>
+              </w:rPr>
+              <w:t xml:space="preserve">Hosting</w:t>
+            </w:r>
+          </w:p>
+        </w:tc>
+        <w:tc>
+          <w:tcPr>
+            <w:tcW w:type="pct" w:w="70%"/>
+            <w:shd w:fill="EBF0F7" w:val="solid"/>
+            <w:tcMar>
+              <w:top w:type="dxa" w:w="80"/>
+              <w:left w:type="dxa" w:w="120"/>
+              <w:bottom w:type="dxa" w:w="80"/>
+              <w:right w:type="dxa" w:w="120"/>
+            </w:tcMar>
+          </w:tcPr>
+          <w:p>
+            <w:r>
+              <w:rPr>
+                <w:sz w:val="20"/>
+                <w:szCs w:val="20"/>
+              </w:rPr>
+              <w:t xml:space="preserve">Vercel (auto-deploy from main branch)</w:t>
+            </w:r>
+          </w:p>
+        </w:tc>
+      </w:tr>
+    </w:tbl>
+    <w:p>
+      <w:pPr>
+        <w:spacing w:after="160"/>
+      </w:pPr>
+    </w:p>
+    <w:p>
+      <w:pPr>
+        <w:pStyle w:val="Heading2"/>
+        <w:spacing w:after="120" w:before="320"/>
+      </w:pPr>
+      <w:r>
+        <w:rPr>
+          <w:b/>
+          <w:bCs/>
+          <w:color w:val="1E3A5F"/>
+          <w:sz w:val="28"/>
+          <w:szCs w:val="28"/>
+        </w:rPr>
+        <w:t xml:space="preserve">1.3  Access URL</w:t>
+      </w:r>
+    </w:p>
+    <w:p>
+      <w:pPr>
+        <w:spacing w:after="120"/>
+      </w:pPr>
+      <w:r>
+        <w:rPr>
+          <w:sz w:val="22"/>
+          <w:szCs w:val="22"/>
+        </w:rPr>
+        <w:t xml:space="preserve">The application is hosted at the URL configured in the NEXT_PUBLIC_APP_URL environment variable. Contact the Application Owner for the current production URL.</w:t>
+      </w:r>
+    </w:p>
+    <w:p>
+      <w:r>
+        <w:br w:type="page"/>
+      </w:r>
+    </w:p>
+    <w:p>
+      <w:pPr>
+        <w:pStyle w:val="Heading1"/>
+        <w:spacing w:after="160" w:before="480"/>
+      </w:pPr>
+      <w:r>
+        <w:rPr>
+          <w:b/>
+          <w:bCs/>
+          <w:color w:val="1E3A5F"/>
+          <w:sz w:val="36"/>
+          <w:szCs w:val="36"/>
+        </w:rPr>
+        <w:t xml:space="preserve">2. User Roles &amp; Permissions</w:t>
+      </w:r>
+    </w:p>
+    <w:p>
+      <w:pPr>
+        <w:pBdr>
+          <w:bottom w:val="single" w:color="1E3A5F" w:sz="6"/>
+        </w:pBdr>
+        <w:spacing w:after="160"/>
+      </w:pPr>
+    </w:p>
+    <w:p>
+      <w:pPr>
+        <w:spacing w:after="120"/>
+      </w:pPr>
+      <w:r>
+        <w:rPr>
+          <w:sz w:val="22"/>
+          <w:szCs w:val="22"/>
+        </w:rPr>
+        <w:t xml:space="preserve">The system has four roles arranged in a hierarchy. Each higher role inherits all permissions of the roles below it.</w:t>
+      </w:r>
+    </w:p>
+    <w:p>
+      <w:pPr>
+        <w:spacing w:after="160"/>
+      </w:pPr>
+    </w:p>
+    <w:tbl>
+      <w:tblPr>
+        <w:tblW w:type="pct" w:w="100%"/>
+        <w:tblBorders>
+          <w:top w:val="single" w:color="auto" w:sz="4"/>
+          <w:left w:val="single" w:color="auto" w:sz="4"/>
+          <w:bottom w:val="single" w:color="auto" w:sz="4"/>
+          <w:right w:val="single" w:color="auto" w:sz="4"/>
+          <w:insideH w:val="single" w:color="auto" w:sz="4"/>
+          <w:insideV w:val="single" w:color="auto" w:sz="4"/>
+        </w:tblBorders>
+      </w:tblPr>
+      <w:tblGrid>
+        <w:gridCol w:w="100"/>
+        <w:gridCol w:w="100"/>
+        <w:gridCol w:w="100"/>
+      </w:tblGrid>
+      <w:tr>
+        <w:trPr>
+          <w:tblHeader/>
+        </w:trPr>
+        <w:tc>
+          <w:tcPr>
+            <w:tcW w:type="pct" w:w="18%"/>
+            <w:shd w:fill="1E3A5F" w:val="solid"/>
+            <w:tcMar>
+              <w:top w:type="dxa" w:w="80"/>
+              <w:left w:type="dxa" w:w="120"/>
+              <w:bottom w:type="dxa" w:w="80"/>
+              <w:right w:type="dxa" w:w="120"/>
+            </w:tcMar>
+          </w:tcPr>
+          <w:p>
+            <w:pPr>
+              <w:jc w:val="left"/>
+            </w:pPr>
+            <w:r>
+              <w:rPr>
+                <w:b/>
+                <w:bCs/>
+                <w:color w:val="FFFFFF"/>
+                <w:sz w:val="20"/>
+                <w:szCs w:val="20"/>
+              </w:rPr>
+              <w:t xml:space="preserve">Role</w:t>
+            </w:r>
+          </w:p>
+        </w:tc>
+        <w:tc>
+          <w:tcPr>
+            <w:tcW w:type="pct" w:w="32%"/>
+            <w:shd w:fill="1E3A5F" w:val="solid"/>
+            <w:tcMar>
+              <w:top w:type="dxa" w:w="80"/>
+              <w:left w:type="dxa" w:w="120"/>
+              <w:bottom w:type="dxa" w:w="80"/>
+              <w:right w:type="dxa" w:w="120"/>
+            </w:tcMar>
+          </w:tcPr>
+          <w:p>
+            <w:pPr>
+              <w:jc w:val="left"/>
+            </w:pPr>
+            <w:r>
+              <w:rPr>
+                <w:b/>
+                <w:bCs/>
+                <w:color w:val="FFFFFF"/>
+                <w:sz w:val="20"/>
+                <w:szCs w:val="20"/>
+              </w:rPr>
+              <w:t xml:space="preserve">Description</w:t>
+            </w:r>
+          </w:p>
+        </w:tc>
+        <w:tc>
+          <w:tcPr>
+            <w:tcW w:type="pct" w:w="50%"/>
+            <w:shd w:fill="1E3A5F" w:val="solid"/>
+            <w:tcMar>
+              <w:top w:type="dxa" w:w="80"/>
+              <w:left w:type="dxa" w:w="120"/>
+              <w:bottom w:type="dxa" w:w="80"/>
+              <w:right w:type="dxa" w:w="120"/>
+            </w:tcMar>
+          </w:tcPr>
+          <w:p>
+            <w:pPr>
+              <w:jc w:val="left"/>
+            </w:pPr>
+            <w:r>
+              <w:rPr>
+                <w:b/>
+                <w:bCs/>
+                <w:color w:val="FFFFFF"/>
+                <w:sz w:val="20"/>
+                <w:szCs w:val="20"/>
+              </w:rPr>
               <w:t xml:space="preserve">Key Permissions</w:t>
             </w:r>
           </w:p>
@@ -1342,7 +1516,7 @@
                 <w:sz w:val="20"/>
                 <w:szCs w:val="20"/>
               </w:rPr>
-              <w:t xml:space="preserve">The system administrator. There is typically one Application Owner.</w:t>
+              <w:t xml:space="preserve">The system administrator. Michael Pisano (mpisano@riverwestpartners.com) holds this role.</w:t>
             </w:r>
           </w:p>
         </w:tc>
@@ -6079,7 +6253,7 @@
           <w:sz w:val="22"/>
           <w:szCs w:val="22"/>
         </w:rPr>
-        <w:t xml:space="preserve">The following environment variables must be configured in Vercel (or .env.local for local development). Contact the Application Owner or a system administrator for the actual values.</w:t>
+        <w:t xml:space="preserve">The following environment variables must be configured in Vercel (or .env.local for local development). Contact the Application Owner, Michael Pisano (mpisano@riverwestpartners.com), for the actual values.</w:t>
       </w:r>
     </w:p>
     <w:p>
@@ -7124,7 +7298,7 @@
           <w:sz w:val="22"/>
           <w:szCs w:val="22"/>
         </w:rPr>
-        <w:t xml:space="preserve">Sign up with the Application Owner email (mpisano@riverwestpartners.com or as configured) and activate your own account via the database if needed for first-time setup.</w:t>
+        <w:t xml:space="preserve">Sign up with the Application Owner email — Michael Pisano (mpisano@riverwestpartners.com) — and activate the account via the database if needed for first-time setup.</w:t>
       </w:r>
     </w:p>
     <w:p>
@@ -7590,7 +7764,7 @@
           <w:sz w:val="22"/>
           <w:szCs w:val="22"/>
         </w:rPr>
-        <w:t xml:space="preserve">Only employees with the Application Owner role see that sidebar section. If you should have this access, contact the current Application Owner to have your role updated under Admin → Employees.</w:t>
+        <w:t xml:space="preserve">Only employees with the Application Owner role see that sidebar section. If you should have this access, contact Michael Pisano (mpisano@riverwestpartners.com) to have your role updated.</w:t>
       </w:r>
     </w:p>
     <w:p>
@@ -7689,7 +7863,7 @@
           <w:sz w:val="22"/>
           <w:szCs w:val="22"/>
         </w:rPr>
-        <w:t xml:space="preserve">Approved reports are permanently locked as the integrity of the accounting record depends on immutability. Contact the Application Owner. If a correction is truly necessary, the report can be soft-deleted and a new report created for the corrected period.</w:t>
+        <w:t xml:space="preserve">Approved reports are permanently locked as the integrity of the accounting record depends on immutability. Contact Michael Pisano (mpisano@riverwestpartners.com). If a correction is truly necessary, he can soft-delete the report and a new report can be created for the corrected period.</w:t>
       </w:r>
     </w:p>
     <w:p>

</xml_diff>

<commit_message>
Add dedicated Analytics section with collapsible sidebar and 5 sub-pages
- New Analytics sidebar section (collapsible) with Overview, Employee Miles,
  Properties, Monthly Trends, and Approval Metrics pages
- All detail pages have sortable column headers and year/manager filters
- Analytics Overview shows live pipeline status and 4 mini-preview sections
  with View Details links to each detail page
- Administration sidebar section is now collapsible to reduce clutter
- Five new API routes: analytics/overview, employees, properties, trends, approvals
- Old /admin/analytics page redirects to /analytics
- README and onboarding document updated to v3.0 with Analytics section
  and remaining Application Owner references cleaned up

https://claude.ai/code/session_019XnFKDaW5cVxd7JfGejRcK
</commit_message>
<xml_diff>
--- a/RiverWest-Travel-Reporting-Onboarding-Guide.docx
+++ b/RiverWest-Travel-Reporting-Onboarding-Guide.docx
@@ -73,7 +73,7 @@
           <w:sz w:val="22"/>
           <w:szCs w:val="22"/>
         </w:rPr>
-        <w:t xml:space="preserve">Version 2.0</w:t>
+        <w:t xml:space="preserve">Version 3.0</w:t>
       </w:r>
     </w:p>
     <w:p>
@@ -87,7 +87,7 @@
           <w:sz w:val="22"/>
           <w:szCs w:val="22"/>
         </w:rPr>
-        <w:t xml:space="preserve">Effective: February 28, 2026</w:t>
+        <w:t xml:space="preserve">Effective: March 1, 2026</w:t>
       </w:r>
     </w:p>
     <w:tbl>
@@ -437,7 +437,7 @@
           <w:sz w:val="22"/>
           <w:szCs w:val="22"/>
         </w:rPr>
-        <w:t xml:space="preserve">Mileage reimbursement rates are managed in the application by the Application Owner</w:t>
+        <w:t xml:space="preserve">Mileage reimbursement rates are managed in the application by an Admin</w:t>
       </w:r>
     </w:p>
     <w:p>
@@ -454,7 +454,7 @@
           <w:sz w:val="22"/>
           <w:szCs w:val="22"/>
         </w:rPr>
-        <w:t xml:space="preserve">New user accounts require activation by the Application Owner before access is granted</w:t>
+        <w:t xml:space="preserve">New user accounts require activation by an Admin before access is granted</w:t>
       </w:r>
     </w:p>
     <w:p>
@@ -471,7 +471,24 @@
           <w:sz w:val="22"/>
           <w:szCs w:val="22"/>
         </w:rPr>
-        <w:t xml:space="preserve">Soft-deleted reports are retained in a log accessible to the Application Owner</w:t>
+        <w:t xml:space="preserve">Soft-deleted reports are retained in a log accessible to Admins</w:t>
+      </w:r>
+    </w:p>
+    <w:p>
+      <w:pPr>
+        <w:pStyle w:val="ListParagraph"/>
+        <w:numPr>
+          <w:ilvl w:val="0"/>
+          <w:numId w:val="1"/>
+        </w:numPr>
+        <w:spacing w:after="80"/>
+      </w:pPr>
+      <w:r>
+        <w:rPr>
+          <w:sz w:val="22"/>
+          <w:szCs w:val="22"/>
+        </w:rPr>
+        <w:t xml:space="preserve">A dedicated Analytics section provides organization-wide mileage, reimbursement, property, and approval-speed reporting</w:t>
       </w:r>
     </w:p>
     <w:p>
@@ -3582,23 +3599,6 @@
           <w:sz w:val="22"/>
           <w:szCs w:val="22"/>
         </w:rPr>
-        <w:t xml:space="preserve">Admins cannot assign or remove the Application Owner role — only the Application Owner can do that.</w:t>
-      </w:r>
-    </w:p>
-    <w:p>
-      <w:pPr>
-        <w:pStyle w:val="ListParagraph"/>
-        <w:numPr>
-          <w:ilvl w:val="0"/>
-          <w:numId w:val="1"/>
-        </w:numPr>
-        <w:spacing w:after="80"/>
-      </w:pPr>
-      <w:r>
-        <w:rPr>
-          <w:sz w:val="22"/>
-          <w:szCs w:val="22"/>
-        </w:rPr>
         <w:t xml:space="preserve">Nobody can change their own role.</w:t>
       </w:r>
     </w:p>
@@ -3860,7 +3860,7 @@
           <w:sz w:val="22"/>
           <w:szCs w:val="22"/>
         </w:rPr>
-        <w:t xml:space="preserve">Admins may soft-delete a report (it moves to the Deleted Reports log accessible to the Application Owner).</w:t>
+        <w:t xml:space="preserve">Admins may soft-delete a report (it moves to the Deleted Reports log accessible to all Admins).</w:t>
       </w:r>
     </w:p>
     <w:p>
@@ -3881,7 +3881,7 @@
           <w:sz w:val="28"/>
           <w:szCs w:val="28"/>
         </w:rPr>
-        <w:t xml:space="preserve">6.4  Admin Dashboard &amp; Analytics</w:t>
+        <w:t xml:space="preserve">6.4  Admin Dashboard</w:t>
       </w:r>
     </w:p>
     <w:p>
@@ -3982,7 +3982,336 @@
           <w:sz w:val="28"/>
           <w:szCs w:val="28"/>
         </w:rPr>
-        <w:t xml:space="preserve">6.5  Bulk Excel Export</w:t>
+        <w:t xml:space="preserve">6.5  Analytics</w:t>
+      </w:r>
+    </w:p>
+    <w:p>
+      <w:pPr>
+        <w:spacing w:after="120"/>
+      </w:pPr>
+      <w:r>
+        <w:rPr>
+          <w:sz w:val="22"/>
+          <w:szCs w:val="22"/>
+        </w:rPr>
+        <w:t xml:space="preserve">The Analytics section in the sidebar provides five detailed reporting views for Admin users:</w:t>
+      </w:r>
+    </w:p>
+    <w:tbl>
+      <w:tblPr>
+        <w:tblW w:type="pct" w:w="100%"/>
+        <w:tblBorders>
+          <w:top w:val="single" w:color="auto" w:sz="4"/>
+          <w:left w:val="single" w:color="auto" w:sz="4"/>
+          <w:bottom w:val="single" w:color="auto" w:sz="4"/>
+          <w:right w:val="single" w:color="auto" w:sz="4"/>
+          <w:insideH w:val="single" w:color="auto" w:sz="4"/>
+          <w:insideV w:val="single" w:color="auto" w:sz="4"/>
+        </w:tblBorders>
+      </w:tblPr>
+      <w:tblGrid>
+        <w:gridCol w:w="100"/>
+        <w:gridCol w:w="100"/>
+      </w:tblGrid>
+      <w:tr>
+        <w:trPr>
+          <w:tblHeader/>
+        </w:trPr>
+        <w:tc>
+          <w:tcPr>
+            <w:tcW w:type="pct" w:w="22%"/>
+            <w:shd w:fill="1E3A5F" w:val="solid"/>
+            <w:tcMar>
+              <w:top w:type="dxa" w:w="80"/>
+              <w:left w:type="dxa" w:w="120"/>
+              <w:bottom w:type="dxa" w:w="80"/>
+              <w:right w:type="dxa" w:w="120"/>
+            </w:tcMar>
+          </w:tcPr>
+          <w:p>
+            <w:pPr>
+              <w:jc w:val="left"/>
+            </w:pPr>
+            <w:r>
+              <w:rPr>
+                <w:b/>
+                <w:bCs/>
+                <w:color w:val="FFFFFF"/>
+                <w:sz w:val="20"/>
+                <w:szCs w:val="20"/>
+              </w:rPr>
+              <w:t xml:space="preserve">Page</w:t>
+            </w:r>
+          </w:p>
+        </w:tc>
+        <w:tc>
+          <w:tcPr>
+            <w:tcW w:type="pct" w:w="78%"/>
+            <w:shd w:fill="1E3A5F" w:val="solid"/>
+            <w:tcMar>
+              <w:top w:type="dxa" w:w="80"/>
+              <w:left w:type="dxa" w:w="120"/>
+              <w:bottom w:type="dxa" w:w="80"/>
+              <w:right w:type="dxa" w:w="120"/>
+            </w:tcMar>
+          </w:tcPr>
+          <w:p>
+            <w:pPr>
+              <w:jc w:val="left"/>
+            </w:pPr>
+            <w:r>
+              <w:rPr>
+                <w:b/>
+                <w:bCs/>
+                <w:color w:val="FFFFFF"/>
+                <w:sz w:val="20"/>
+                <w:szCs w:val="20"/>
+              </w:rPr>
+              <w:t xml:space="preserve">Description</w:t>
+            </w:r>
+          </w:p>
+        </w:tc>
+      </w:tr>
+      <w:tr>
+        <w:tc>
+          <w:tcPr>
+            <w:tcW w:type="pct" w:w="22%"/>
+            <w:shd w:fill="FFFFFF" w:val="solid"/>
+            <w:tcMar>
+              <w:top w:type="dxa" w:w="80"/>
+              <w:left w:type="dxa" w:w="120"/>
+              <w:bottom w:type="dxa" w:w="80"/>
+              <w:right w:type="dxa" w:w="120"/>
+            </w:tcMar>
+          </w:tcPr>
+          <w:p>
+            <w:r>
+              <w:rPr>
+                <w:sz w:val="20"/>
+                <w:szCs w:val="20"/>
+              </w:rPr>
+              <w:t xml:space="preserve">Overview</w:t>
+            </w:r>
+          </w:p>
+        </w:tc>
+        <w:tc>
+          <w:tcPr>
+            <w:tcW w:type="pct" w:w="78%"/>
+            <w:shd w:fill="FFFFFF" w:val="solid"/>
+            <w:tcMar>
+              <w:top w:type="dxa" w:w="80"/>
+              <w:left w:type="dxa" w:w="120"/>
+              <w:bottom w:type="dxa" w:w="80"/>
+              <w:right w:type="dxa" w:w="120"/>
+            </w:tcMar>
+          </w:tcPr>
+          <w:p>
+            <w:r>
+              <w:rPr>
+                <w:sz w:val="20"/>
+                <w:szCs w:val="20"/>
+              </w:rPr>
+              <w:t xml:space="preserve">Radar view — live pipeline status (pending/draft/needs revision), year summary, top employees, top destinations, recent monthly activity, and approval speed highlights.</w:t>
+            </w:r>
+          </w:p>
+        </w:tc>
+      </w:tr>
+      <w:tr>
+        <w:tc>
+          <w:tcPr>
+            <w:tcW w:type="pct" w:w="22%"/>
+            <w:shd w:fill="EBF0F7" w:val="solid"/>
+            <w:tcMar>
+              <w:top w:type="dxa" w:w="80"/>
+              <w:left w:type="dxa" w:w="120"/>
+              <w:bottom w:type="dxa" w:w="80"/>
+              <w:right w:type="dxa" w:w="120"/>
+            </w:tcMar>
+          </w:tcPr>
+          <w:p>
+            <w:r>
+              <w:rPr>
+                <w:sz w:val="20"/>
+                <w:szCs w:val="20"/>
+              </w:rPr>
+              <w:t xml:space="preserve">Employee Miles</w:t>
+            </w:r>
+          </w:p>
+        </w:tc>
+        <w:tc>
+          <w:tcPr>
+            <w:tcW w:type="pct" w:w="78%"/>
+            <w:shd w:fill="EBF0F7" w:val="solid"/>
+            <w:tcMar>
+              <w:top w:type="dxa" w:w="80"/>
+              <w:left w:type="dxa" w:w="120"/>
+              <w:bottom w:type="dxa" w:w="80"/>
+              <w:right w:type="dxa" w:w="120"/>
+            </w:tcMar>
+          </w:tcPr>
+          <w:p>
+            <w:r>
+              <w:rPr>
+                <w:sz w:val="20"/>
+                <w:szCs w:val="20"/>
+              </w:rPr>
+              <w:t xml:space="preserve">Sortable table of all employees with trip count, total miles, total reimbursed, and average miles per trip. Filter by year and manager.</w:t>
+            </w:r>
+          </w:p>
+        </w:tc>
+      </w:tr>
+      <w:tr>
+        <w:tc>
+          <w:tcPr>
+            <w:tcW w:type="pct" w:w="22%"/>
+            <w:shd w:fill="FFFFFF" w:val="solid"/>
+            <w:tcMar>
+              <w:top w:type="dxa" w:w="80"/>
+              <w:left w:type="dxa" w:w="120"/>
+              <w:bottom w:type="dxa" w:w="80"/>
+              <w:right w:type="dxa" w:w="120"/>
+            </w:tcMar>
+          </w:tcPr>
+          <w:p>
+            <w:r>
+              <w:rPr>
+                <w:sz w:val="20"/>
+                <w:szCs w:val="20"/>
+              </w:rPr>
+              <w:t xml:space="preserve">Properties</w:t>
+            </w:r>
+          </w:p>
+        </w:tc>
+        <w:tc>
+          <w:tcPr>
+            <w:tcW w:type="pct" w:w="78%"/>
+            <w:shd w:fill="FFFFFF" w:val="solid"/>
+            <w:tcMar>
+              <w:top w:type="dxa" w:w="80"/>
+              <w:left w:type="dxa" w:w="120"/>
+              <w:bottom w:type="dxa" w:w="80"/>
+              <w:right w:type="dxa" w:w="120"/>
+            </w:tcMar>
+          </w:tcPr>
+          <w:p>
+            <w:r>
+              <w:rPr>
+                <w:sz w:val="20"/>
+                <w:szCs w:val="20"/>
+              </w:rPr>
+              <w:t xml:space="preserve">Trip activity by property — trips as origin, trips as destination, total trips, miles, and reimbursement. Filter by year.</w:t>
+            </w:r>
+          </w:p>
+        </w:tc>
+      </w:tr>
+      <w:tr>
+        <w:tc>
+          <w:tcPr>
+            <w:tcW w:type="pct" w:w="22%"/>
+            <w:shd w:fill="EBF0F7" w:val="solid"/>
+            <w:tcMar>
+              <w:top w:type="dxa" w:w="80"/>
+              <w:left w:type="dxa" w:w="120"/>
+              <w:bottom w:type="dxa" w:w="80"/>
+              <w:right w:type="dxa" w:w="120"/>
+            </w:tcMar>
+          </w:tcPr>
+          <w:p>
+            <w:r>
+              <w:rPr>
+                <w:sz w:val="20"/>
+                <w:szCs w:val="20"/>
+              </w:rPr>
+              <w:t xml:space="preserve">Monthly Trends</w:t>
+            </w:r>
+          </w:p>
+        </w:tc>
+        <w:tc>
+          <w:tcPr>
+            <w:tcW w:type="pct" w:w="78%"/>
+            <w:shd w:fill="EBF0F7" w:val="solid"/>
+            <w:tcMar>
+              <w:top w:type="dxa" w:w="80"/>
+              <w:left w:type="dxa" w:w="120"/>
+              <w:bottom w:type="dxa" w:w="80"/>
+              <w:right w:type="dxa" w:w="120"/>
+            </w:tcMar>
+          </w:tcPr>
+          <w:p>
+            <w:r>
+              <w:rPr>
+                <w:sz w:val="20"/>
+                <w:szCs w:val="20"/>
+              </w:rPr>
+              <w:t xml:space="preserve">Chronological month-by-month breakdown of trips, miles, and reimbursement with inline bar visualization. Filter by year.</w:t>
+            </w:r>
+          </w:p>
+        </w:tc>
+      </w:tr>
+      <w:tr>
+        <w:tc>
+          <w:tcPr>
+            <w:tcW w:type="pct" w:w="22%"/>
+            <w:shd w:fill="FFFFFF" w:val="solid"/>
+            <w:tcMar>
+              <w:top w:type="dxa" w:w="80"/>
+              <w:left w:type="dxa" w:w="120"/>
+              <w:bottom w:type="dxa" w:w="80"/>
+              <w:right w:type="dxa" w:w="120"/>
+            </w:tcMar>
+          </w:tcPr>
+          <w:p>
+            <w:r>
+              <w:rPr>
+                <w:sz w:val="20"/>
+                <w:szCs w:val="20"/>
+              </w:rPr>
+              <w:t xml:space="preserve">Approval Metrics</w:t>
+            </w:r>
+          </w:p>
+        </w:tc>
+        <w:tc>
+          <w:tcPr>
+            <w:tcW w:type="pct" w:w="78%"/>
+            <w:shd w:fill="FFFFFF" w:val="solid"/>
+            <w:tcMar>
+              <w:top w:type="dxa" w:w="80"/>
+              <w:left w:type="dxa" w:w="120"/>
+              <w:bottom w:type="dxa" w:w="80"/>
+              <w:right w:type="dxa" w:w="120"/>
+            </w:tcMar>
+          </w:tcPr>
+          <w:p>
+            <w:r>
+              <w:rPr>
+                <w:sz w:val="20"/>
+                <w:szCs w:val="20"/>
+              </w:rPr>
+              <w:t xml:space="preserve">Manager turnaround time — average days from submission to decision, reports reviewed, approved, and returned. Color-coded bars (green = fast). Filter by year and manager.</w:t>
+            </w:r>
+          </w:p>
+        </w:tc>
+      </w:tr>
+    </w:tbl>
+    <w:p>
+      <w:pPr>
+        <w:spacing w:after="160"/>
+      </w:pPr>
+    </w:p>
+    <w:p>
+      <w:pPr>
+        <w:pStyle w:val="Heading2"/>
+        <w:spacing w:after="120" w:before="320"/>
+      </w:pPr>
+      <w:r>
+        <w:rPr>
+          <w:b/>
+          <w:bCs/>
+          <w:color w:val="1E3A5F"/>
+          <w:sz w:val="28"/>
+          <w:szCs w:val="28"/>
+        </w:rPr>
+        <w:t xml:space="preserve">6.6  Bulk Excel Export</w:t>
       </w:r>
     </w:p>
     <w:p>
@@ -4714,7 +5043,7 @@
                 <w:sz w:val="20"/>
                 <w:szCs w:val="20"/>
               </w:rPr>
-              <w:t xml:space="preserve">Any assigned approver or Admin/AO</w:t>
+              <w:t xml:space="preserve">Any assigned approver or Admin</w:t>
             </w:r>
           </w:p>
         </w:tc>
@@ -4887,7 +5216,7 @@
                 <w:sz w:val="20"/>
                 <w:szCs w:val="20"/>
               </w:rPr>
-              <w:t xml:space="preserve">Admin/AO (soft delete only)</w:t>
+              <w:t xml:space="preserve">Admin (soft delete only)</w:t>
             </w:r>
           </w:p>
         </w:tc>
@@ -4975,7 +5304,7 @@
                 <w:sz w:val="20"/>
                 <w:szCs w:val="20"/>
               </w:rPr>
-              <w:t xml:space="preserve">Reports are never hard-deleted through normal workflows. Even soft-deleted reports remain accessible to the Application Owner in the Deleted Reports log.</w:t>
+              <w:t xml:space="preserve">Reports are never hard-deleted through normal workflows. Even soft-deleted reports remain accessible to Admins in the Deleted Reports log.</w:t>
             </w:r>
           </w:p>
         </w:tc>
@@ -7114,7 +7443,7 @@
                 <w:sz w:val="20"/>
                 <w:szCs w:val="20"/>
               </w:rPr>
-              <w:t xml:space="preserve">The mileage reimbursement rate is NOT configured via an environment variable. It is managed entirely within the application under Application Owner → Mileage Rates. This allows the rate to be updated without a code deployment.</w:t>
+              <w:t xml:space="preserve">The mileage reimbursement rate is NOT configured via an environment variable. It is managed entirely within the application under Administration → Mileage Rates. This allows the rate to be updated without a code deployment.</w:t>
             </w:r>
           </w:p>
         </w:tc>
@@ -7660,7 +7989,7 @@
           <w:sz w:val="28"/>
           <w:szCs w:val="28"/>
         </w:rPr>
-        <w:t xml:space="preserve">"I cannot see the full Administration section in the sidebar."</w:t>
+        <w:t xml:space="preserve">"I cannot see the Administration or Analytics sections in the sidebar."</w:t>
       </w:r>
     </w:p>
     <w:p>
@@ -7672,7 +8001,7 @@
           <w:sz w:val="22"/>
           <w:szCs w:val="22"/>
         </w:rPr>
-        <w:t xml:space="preserve">The full Administration section (including Pending Users, Mileage Rates, and Deleted Reports) is visible only to Admins. If you should have Admin access, contact Michael Pisano (mpisano@riverwestpartners.com) to have your role updated.</w:t>
+        <w:t xml:space="preserve">The Administration and Analytics sections are visible only to Admins. If you should have Admin access, contact Michael Pisano (mpisano@riverwestpartners.com) to have your role updated.</w:t>
       </w:r>
     </w:p>
     <w:p>

</xml_diff>